<commit_message>
docs(update): cap nhat bao cao them anh minh chung
Co-authored-by: Cursor <cursoragent@cursor.com>
</commit_message>
<xml_diff>
--- a/Bao_cao_Assignment1_FER202_LaptopStore_Group6_v2.docx
+++ b/Bao_cao_Assignment1_FER202_LaptopStore_Group6_v2.docx
@@ -4546,24 +4546,238 @@
       <w:pPr>
         <w:pStyle w:val="ListParagraph"/>
         <w:spacing w:line="276" w:lineRule="auto"/>
-      </w:pPr>
-      <w:r>
         <w:rPr>
           <w:sz w:val="24"/>
         </w:rPr>
+      </w:pPr>
+      <w:r>
+        <w:rPr>
+          <w:sz w:val="24"/>
+        </w:rPr>
         <w:t>[x] Không commit db.json đã bị json-server ghi đè khi test</w:t>
       </w:r>
     </w:p>
     <w:p>
       <w:pPr>
+        <w:pStyle w:val="ListParagraph"/>
+        <w:spacing w:line="276" w:lineRule="auto"/>
+        <w:rPr>
+          <w:sz w:val="24"/>
+        </w:rPr>
+      </w:pPr>
+    </w:p>
+    <w:p>
+      <w:pPr>
+        <w:pStyle w:val="ListParagraph"/>
+        <w:spacing w:line="276" w:lineRule="auto"/>
+      </w:pPr>
+      <w:r>
+        <w:lastRenderedPageBreak/>
+        <w:drawing>
+          <wp:inline distT="0" distB="0" distL="0" distR="0" wp14:anchorId="166C8348" wp14:editId="38C82AB1">
+            <wp:extent cx="5943600" cy="6165850"/>
+            <wp:effectExtent l="0" t="0" r="0" b="6350"/>
+            <wp:docPr id="10" name="Picture 10"/>
+            <wp:cNvGraphicFramePr>
+              <a:graphicFrameLocks xmlns:a="http://schemas.openxmlformats.org/drawingml/2006/main" noChangeAspect="1"/>
+            </wp:cNvGraphicFramePr>
+            <a:graphic xmlns:a="http://schemas.openxmlformats.org/drawingml/2006/main">
+              <a:graphicData uri="http://schemas.openxmlformats.org/drawingml/2006/picture">
+                <pic:pic xmlns:pic="http://schemas.openxmlformats.org/drawingml/2006/picture">
+                  <pic:nvPicPr>
+                    <pic:cNvPr id="1" name=""/>
+                    <pic:cNvPicPr/>
+                  </pic:nvPicPr>
+                  <pic:blipFill>
+                    <a:blip r:embed="rId15"/>
+                    <a:stretch>
+                      <a:fillRect/>
+                    </a:stretch>
+                  </pic:blipFill>
+                  <pic:spPr>
+                    <a:xfrm>
+                      <a:off x="0" y="0"/>
+                      <a:ext cx="5943600" cy="6165850"/>
+                    </a:xfrm>
+                    <a:prstGeom prst="rect">
+                      <a:avLst/>
+                    </a:prstGeom>
+                  </pic:spPr>
+                </pic:pic>
+              </a:graphicData>
+            </a:graphic>
+          </wp:inline>
+        </w:drawing>
+      </w:r>
+      <w:r>
+        <w:lastRenderedPageBreak/>
+        <w:drawing>
+          <wp:inline distT="0" distB="0" distL="0" distR="0" wp14:anchorId="6136661A" wp14:editId="5DB31342">
+            <wp:extent cx="5943600" cy="6142990"/>
+            <wp:effectExtent l="0" t="0" r="0" b="0"/>
+            <wp:docPr id="5" name="Picture 5"/>
+            <wp:cNvGraphicFramePr>
+              <a:graphicFrameLocks xmlns:a="http://schemas.openxmlformats.org/drawingml/2006/main" noChangeAspect="1"/>
+            </wp:cNvGraphicFramePr>
+            <a:graphic xmlns:a="http://schemas.openxmlformats.org/drawingml/2006/main">
+              <a:graphicData uri="http://schemas.openxmlformats.org/drawingml/2006/picture">
+                <pic:pic xmlns:pic="http://schemas.openxmlformats.org/drawingml/2006/picture">
+                  <pic:nvPicPr>
+                    <pic:cNvPr id="1" name=""/>
+                    <pic:cNvPicPr/>
+                  </pic:nvPicPr>
+                  <pic:blipFill>
+                    <a:blip r:embed="rId16"/>
+                    <a:stretch>
+                      <a:fillRect/>
+                    </a:stretch>
+                  </pic:blipFill>
+                  <pic:spPr>
+                    <a:xfrm>
+                      <a:off x="0" y="0"/>
+                      <a:ext cx="5943600" cy="6142990"/>
+                    </a:xfrm>
+                    <a:prstGeom prst="rect">
+                      <a:avLst/>
+                    </a:prstGeom>
+                  </pic:spPr>
+                </pic:pic>
+              </a:graphicData>
+            </a:graphic>
+          </wp:inline>
+        </w:drawing>
+      </w:r>
+    </w:p>
+    <w:p>
+      <w:pPr>
         <w:spacing w:before="0" w:after="120" w:line="276" w:lineRule="auto"/>
-      </w:pPr>
-      <w:r>
         <w:rPr>
           <w:i/>
           <w:sz w:val="22"/>
         </w:rPr>
-        <w:t>[Chèn ảnh: đoạn db.json (users/brands/laptops) + kết quả reset-db]</w:t>
+      </w:pPr>
+      <w:r>
+        <w:rPr>
+          <w:i/>
+          <w:sz w:val="22"/>
+        </w:rPr>
+        <w:lastRenderedPageBreak/>
+        <w:drawing>
+          <wp:inline distT="0" distB="0" distL="0" distR="0" wp14:anchorId="65405CF8" wp14:editId="744CC2A3">
+            <wp:extent cx="5943600" cy="5410200"/>
+            <wp:effectExtent l="0" t="0" r="0" b="0"/>
+            <wp:docPr id="9" name="Picture 9"/>
+            <wp:cNvGraphicFramePr>
+              <a:graphicFrameLocks xmlns:a="http://schemas.openxmlformats.org/drawingml/2006/main" noChangeAspect="1"/>
+            </wp:cNvGraphicFramePr>
+            <a:graphic xmlns:a="http://schemas.openxmlformats.org/drawingml/2006/main">
+              <a:graphicData uri="http://schemas.openxmlformats.org/drawingml/2006/picture">
+                <pic:pic xmlns:pic="http://schemas.openxmlformats.org/drawingml/2006/picture">
+                  <pic:nvPicPr>
+                    <pic:cNvPr id="1" name=""/>
+                    <pic:cNvPicPr/>
+                  </pic:nvPicPr>
+                  <pic:blipFill>
+                    <a:blip r:embed="rId17"/>
+                    <a:stretch>
+                      <a:fillRect/>
+                    </a:stretch>
+                  </pic:blipFill>
+                  <pic:spPr>
+                    <a:xfrm>
+                      <a:off x="0" y="0"/>
+                      <a:ext cx="5943600" cy="5410200"/>
+                    </a:xfrm>
+                    <a:prstGeom prst="rect">
+                      <a:avLst/>
+                    </a:prstGeom>
+                  </pic:spPr>
+                </pic:pic>
+              </a:graphicData>
+            </a:graphic>
+          </wp:inline>
+        </w:drawing>
+      </w:r>
+    </w:p>
+    <w:p>
+      <w:pPr>
+        <w:spacing w:before="0" w:after="120" w:line="276" w:lineRule="auto"/>
+        <w:jc w:val="center"/>
+        <w:rPr>
+          <w:i/>
+          <w:sz w:val="22"/>
+        </w:rPr>
+      </w:pPr>
+      <w:r>
+        <w:rPr>
+          <w:i/>
+          <w:sz w:val="22"/>
+        </w:rPr>
+        <w:t>db.json (users/brands/laptops)</w:t>
+      </w:r>
+    </w:p>
+    <w:p>
+      <w:pPr>
+        <w:spacing w:before="0" w:after="120" w:line="276" w:lineRule="auto"/>
+        <w:rPr>
+          <w:i/>
+          <w:sz w:val="22"/>
+        </w:rPr>
+      </w:pPr>
+      <w:r>
+        <w:rPr>
+          <w:i/>
+          <w:sz w:val="22"/>
+        </w:rPr>
+        <w:lastRenderedPageBreak/>
+        <w:drawing>
+          <wp:inline distT="0" distB="0" distL="0" distR="0" wp14:anchorId="7C643ABF" wp14:editId="2244BF82">
+            <wp:extent cx="5943600" cy="2841625"/>
+            <wp:effectExtent l="0" t="0" r="0" b="0"/>
+            <wp:docPr id="11" name="Picture 11"/>
+            <wp:cNvGraphicFramePr>
+              <a:graphicFrameLocks xmlns:a="http://schemas.openxmlformats.org/drawingml/2006/main" noChangeAspect="1"/>
+            </wp:cNvGraphicFramePr>
+            <a:graphic xmlns:a="http://schemas.openxmlformats.org/drawingml/2006/main">
+              <a:graphicData uri="http://schemas.openxmlformats.org/drawingml/2006/picture">
+                <pic:pic xmlns:pic="http://schemas.openxmlformats.org/drawingml/2006/picture">
+                  <pic:nvPicPr>
+                    <pic:cNvPr id="1" name=""/>
+                    <pic:cNvPicPr/>
+                  </pic:nvPicPr>
+                  <pic:blipFill>
+                    <a:blip r:embed="rId18"/>
+                    <a:stretch>
+                      <a:fillRect/>
+                    </a:stretch>
+                  </pic:blipFill>
+                  <pic:spPr>
+                    <a:xfrm>
+                      <a:off x="0" y="0"/>
+                      <a:ext cx="5943600" cy="2841625"/>
+                    </a:xfrm>
+                    <a:prstGeom prst="rect">
+                      <a:avLst/>
+                    </a:prstGeom>
+                  </pic:spPr>
+                </pic:pic>
+              </a:graphicData>
+            </a:graphic>
+          </wp:inline>
+        </w:drawing>
+      </w:r>
+    </w:p>
+    <w:p>
+      <w:pPr>
+        <w:spacing w:before="0" w:after="120" w:line="276" w:lineRule="auto"/>
+        <w:jc w:val="center"/>
+      </w:pPr>
+      <w:r>
+        <w:rPr>
+          <w:i/>
+          <w:sz w:val="22"/>
+        </w:rPr>
+        <w:t>kết quả reset-db</w:t>
       </w:r>
     </w:p>
     <w:p>
@@ -4731,11 +4945,14 @@
     <w:p>
       <w:pPr>
         <w:spacing w:before="0" w:after="120" w:line="276" w:lineRule="auto"/>
-      </w:pPr>
-      <w:r>
         <w:rPr>
           <w:sz w:val="24"/>
         </w:rPr>
+      </w:pPr>
+      <w:r>
+        <w:rPr>
+          <w:sz w:val="24"/>
+        </w:rPr>
         <w:t>Checklist: [x] json-server trả JSON đúng; có header X-Total-Count khi phân trang (dùng cho UI).</w:t>
       </w:r>
     </w:p>
@@ -4744,11 +4961,119 @@
         <w:spacing w:before="0" w:after="120" w:line="276" w:lineRule="auto"/>
       </w:pPr>
       <w:r>
-        <w:rPr>
-          <w:i/>
-          <w:sz w:val="22"/>
-        </w:rPr>
-        <w:t>[Chèn ảnh: Postman / trình duyệt với vài query trên]</w:t>
+        <w:lastRenderedPageBreak/>
+        <w:drawing>
+          <wp:inline distT="0" distB="0" distL="0" distR="0" wp14:anchorId="33BE376B" wp14:editId="573966F9">
+            <wp:extent cx="5943600" cy="3075305"/>
+            <wp:effectExtent l="0" t="0" r="0" b="0"/>
+            <wp:docPr id="12" name="Picture 12"/>
+            <wp:cNvGraphicFramePr>
+              <a:graphicFrameLocks xmlns:a="http://schemas.openxmlformats.org/drawingml/2006/main" noChangeAspect="1"/>
+            </wp:cNvGraphicFramePr>
+            <a:graphic xmlns:a="http://schemas.openxmlformats.org/drawingml/2006/main">
+              <a:graphicData uri="http://schemas.openxmlformats.org/drawingml/2006/picture">
+                <pic:pic xmlns:pic="http://schemas.openxmlformats.org/drawingml/2006/picture">
+                  <pic:nvPicPr>
+                    <pic:cNvPr id="1" name=""/>
+                    <pic:cNvPicPr/>
+                  </pic:nvPicPr>
+                  <pic:blipFill>
+                    <a:blip r:embed="rId19"/>
+                    <a:stretch>
+                      <a:fillRect/>
+                    </a:stretch>
+                  </pic:blipFill>
+                  <pic:spPr>
+                    <a:xfrm>
+                      <a:off x="0" y="0"/>
+                      <a:ext cx="5943600" cy="3075305"/>
+                    </a:xfrm>
+                    <a:prstGeom prst="rect">
+                      <a:avLst/>
+                    </a:prstGeom>
+                  </pic:spPr>
+                </pic:pic>
+              </a:graphicData>
+            </a:graphic>
+          </wp:inline>
+        </w:drawing>
+      </w:r>
+    </w:p>
+    <w:p>
+      <w:pPr>
+        <w:spacing w:before="0" w:after="120" w:line="276" w:lineRule="auto"/>
+        <w:jc w:val="center"/>
+        <w:rPr>
+          <w:sz w:val="18"/>
+          <w:szCs w:val="18"/>
+        </w:rPr>
+      </w:pPr>
+      <w:r>
+        <w:rPr>
+          <w:sz w:val="18"/>
+          <w:szCs w:val="18"/>
+        </w:rPr>
+        <w:t>Hình 2.4.1 – GET /laptops phân trang _page=1&amp;_limit=8</w:t>
+      </w:r>
+    </w:p>
+    <w:p>
+      <w:pPr>
+        <w:spacing w:before="0" w:after="120" w:line="276" w:lineRule="auto"/>
+      </w:pPr>
+      <w:r>
+        <w:drawing>
+          <wp:inline distT="0" distB="0" distL="0" distR="0" wp14:anchorId="34749FB2" wp14:editId="08AAEFD8">
+            <wp:extent cx="5943600" cy="4667885"/>
+            <wp:effectExtent l="0" t="0" r="0" b="0"/>
+            <wp:docPr id="13" name="Picture 13"/>
+            <wp:cNvGraphicFramePr>
+              <a:graphicFrameLocks xmlns:a="http://schemas.openxmlformats.org/drawingml/2006/main" noChangeAspect="1"/>
+            </wp:cNvGraphicFramePr>
+            <a:graphic xmlns:a="http://schemas.openxmlformats.org/drawingml/2006/main">
+              <a:graphicData uri="http://schemas.openxmlformats.org/drawingml/2006/picture">
+                <pic:pic xmlns:pic="http://schemas.openxmlformats.org/drawingml/2006/picture">
+                  <pic:nvPicPr>
+                    <pic:cNvPr id="1" name=""/>
+                    <pic:cNvPicPr/>
+                  </pic:nvPicPr>
+                  <pic:blipFill>
+                    <a:blip r:embed="rId20"/>
+                    <a:stretch>
+                      <a:fillRect/>
+                    </a:stretch>
+                  </pic:blipFill>
+                  <pic:spPr>
+                    <a:xfrm>
+                      <a:off x="0" y="0"/>
+                      <a:ext cx="5943600" cy="4667885"/>
+                    </a:xfrm>
+                    <a:prstGeom prst="rect">
+                      <a:avLst/>
+                    </a:prstGeom>
+                  </pic:spPr>
+                </pic:pic>
+              </a:graphicData>
+            </a:graphic>
+          </wp:inline>
+        </w:drawing>
+      </w:r>
+    </w:p>
+    <w:p>
+      <w:pPr>
+        <w:spacing w:before="0" w:after="120" w:line="276" w:lineRule="auto"/>
+        <w:jc w:val="center"/>
+        <w:rPr>
+          <w:sz w:val="16"/>
+          <w:szCs w:val="16"/>
+        </w:rPr>
+      </w:pPr>
+      <w:r>
+        <w:rPr>
+          <w:sz w:val="16"/>
+          <w:szCs w:val="16"/>
+        </w:rPr>
+        <w:lastRenderedPageBreak/>
+        <w:t>Hình 2.4.2 – Response header X-Total-Count khi phân trang</w:t>
       </w:r>
     </w:p>
     <w:p>
@@ -4828,12 +5153,230 @@
     <w:p>
       <w:pPr>
         <w:spacing w:before="0" w:after="120" w:line="276" w:lineRule="auto"/>
-      </w:pPr>
-      <w:r>
         <w:rPr>
           <w:sz w:val="24"/>
         </w:rPr>
+      </w:pPr>
+      <w:r>
+        <w:rPr>
+          <w:sz w:val="24"/>
+        </w:rPr>
         <w:t>Checklist: [x] formatPrice/formatDate; [x] giá bán &amp; % giảm đúng quy tắc BR-03.</w:t>
+      </w:r>
+    </w:p>
+    <w:p>
+      <w:pPr>
+        <w:spacing w:before="0" w:after="120" w:line="276" w:lineRule="auto"/>
+      </w:pPr>
+      <w:r>
+        <w:rPr>
+          <w:noProof/>
+          <w14:ligatures w14:val="standardContextual"/>
+        </w:rPr>
+        <w:lastRenderedPageBreak/>
+        <w:drawing>
+          <wp:inline distT="0" distB="0" distL="0" distR="0" wp14:anchorId="6CC7E5BC" wp14:editId="645DF47E">
+            <wp:extent cx="5943600" cy="1877695"/>
+            <wp:effectExtent l="0" t="0" r="0" b="8255"/>
+            <wp:docPr id="14" name="Picture 14"/>
+            <wp:cNvGraphicFramePr>
+              <a:graphicFrameLocks xmlns:a="http://schemas.openxmlformats.org/drawingml/2006/main" noChangeAspect="1"/>
+            </wp:cNvGraphicFramePr>
+            <a:graphic xmlns:a="http://schemas.openxmlformats.org/drawingml/2006/main">
+              <a:graphicData uri="http://schemas.openxmlformats.org/drawingml/2006/picture">
+                <pic:pic xmlns:pic="http://schemas.openxmlformats.org/drawingml/2006/picture">
+                  <pic:nvPicPr>
+                    <pic:cNvPr id="1" name=""/>
+                    <pic:cNvPicPr/>
+                  </pic:nvPicPr>
+                  <pic:blipFill>
+                    <a:blip r:embed="rId21"/>
+                    <a:stretch>
+                      <a:fillRect/>
+                    </a:stretch>
+                  </pic:blipFill>
+                  <pic:spPr>
+                    <a:xfrm>
+                      <a:off x="0" y="0"/>
+                      <a:ext cx="5943600" cy="1877695"/>
+                    </a:xfrm>
+                    <a:prstGeom prst="rect">
+                      <a:avLst/>
+                    </a:prstGeom>
+                  </pic:spPr>
+                </pic:pic>
+              </a:graphicData>
+            </a:graphic>
+          </wp:inline>
+        </w:drawing>
+      </w:r>
+      <w:r>
+        <w:rPr>
+          <w:noProof/>
+          <w14:ligatures w14:val="standardContextual"/>
+        </w:rPr>
+        <w:drawing>
+          <wp:inline distT="0" distB="0" distL="0" distR="0" wp14:anchorId="50418DE0" wp14:editId="6726758E">
+            <wp:extent cx="5943600" cy="2835275"/>
+            <wp:effectExtent l="0" t="0" r="0" b="3175"/>
+            <wp:docPr id="15" name="Picture 15"/>
+            <wp:cNvGraphicFramePr>
+              <a:graphicFrameLocks xmlns:a="http://schemas.openxmlformats.org/drawingml/2006/main" noChangeAspect="1"/>
+            </wp:cNvGraphicFramePr>
+            <a:graphic xmlns:a="http://schemas.openxmlformats.org/drawingml/2006/main">
+              <a:graphicData uri="http://schemas.openxmlformats.org/drawingml/2006/picture">
+                <pic:pic xmlns:pic="http://schemas.openxmlformats.org/drawingml/2006/picture">
+                  <pic:nvPicPr>
+                    <pic:cNvPr id="1" name=""/>
+                    <pic:cNvPicPr/>
+                  </pic:nvPicPr>
+                  <pic:blipFill>
+                    <a:blip r:embed="rId22"/>
+                    <a:stretch>
+                      <a:fillRect/>
+                    </a:stretch>
+                  </pic:blipFill>
+                  <pic:spPr>
+                    <a:xfrm>
+                      <a:off x="0" y="0"/>
+                      <a:ext cx="5943600" cy="2835275"/>
+                    </a:xfrm>
+                    <a:prstGeom prst="rect">
+                      <a:avLst/>
+                    </a:prstGeom>
+                  </pic:spPr>
+                </pic:pic>
+              </a:graphicData>
+            </a:graphic>
+          </wp:inline>
+        </w:drawing>
+      </w:r>
+      <w:r>
+        <w:rPr>
+          <w:noProof/>
+          <w14:ligatures w14:val="standardContextual"/>
+        </w:rPr>
+        <w:lastRenderedPageBreak/>
+        <w:drawing>
+          <wp:inline distT="0" distB="0" distL="0" distR="0" wp14:anchorId="741E4A0B" wp14:editId="2DF98B16">
+            <wp:extent cx="5943600" cy="3898265"/>
+            <wp:effectExtent l="0" t="0" r="0" b="6985"/>
+            <wp:docPr id="16" name="Picture 16"/>
+            <wp:cNvGraphicFramePr>
+              <a:graphicFrameLocks xmlns:a="http://schemas.openxmlformats.org/drawingml/2006/main" noChangeAspect="1"/>
+            </wp:cNvGraphicFramePr>
+            <a:graphic xmlns:a="http://schemas.openxmlformats.org/drawingml/2006/main">
+              <a:graphicData uri="http://schemas.openxmlformats.org/drawingml/2006/picture">
+                <pic:pic xmlns:pic="http://schemas.openxmlformats.org/drawingml/2006/picture">
+                  <pic:nvPicPr>
+                    <pic:cNvPr id="1" name=""/>
+                    <pic:cNvPicPr/>
+                  </pic:nvPicPr>
+                  <pic:blipFill>
+                    <a:blip r:embed="rId23"/>
+                    <a:stretch>
+                      <a:fillRect/>
+                    </a:stretch>
+                  </pic:blipFill>
+                  <pic:spPr>
+                    <a:xfrm>
+                      <a:off x="0" y="0"/>
+                      <a:ext cx="5943600" cy="3898265"/>
+                    </a:xfrm>
+                    <a:prstGeom prst="rect">
+                      <a:avLst/>
+                    </a:prstGeom>
+                  </pic:spPr>
+                </pic:pic>
+              </a:graphicData>
+            </a:graphic>
+          </wp:inline>
+        </w:drawing>
+      </w:r>
+    </w:p>
+    <w:p>
+      <w:pPr>
+        <w:spacing w:before="0" w:after="120" w:line="276" w:lineRule="auto"/>
+        <w:jc w:val="center"/>
+        <w:rPr>
+          <w:sz w:val="16"/>
+          <w:szCs w:val="16"/>
+        </w:rPr>
+      </w:pPr>
+      <w:r>
+        <w:rPr>
+          <w:sz w:val="16"/>
+          <w:szCs w:val="16"/>
+        </w:rPr>
+        <w:t>Hình 2.5.1 – src/utils/format.js (formatPrice, formatDate, giá bán &amp; % giảm)</w:t>
+      </w:r>
+    </w:p>
+    <w:p>
+      <w:pPr>
+        <w:spacing w:before="0" w:after="120" w:line="276" w:lineRule="auto"/>
+        <w:rPr>
+          <w:sz w:val="16"/>
+          <w:szCs w:val="16"/>
+        </w:rPr>
+      </w:pPr>
+      <w:r>
+        <w:rPr>
+          <w:sz w:val="16"/>
+          <w:szCs w:val="16"/>
+        </w:rPr>
+        <w:lastRenderedPageBreak/>
+        <w:drawing>
+          <wp:inline distT="0" distB="0" distL="0" distR="0" wp14:anchorId="4C07D41B" wp14:editId="36DB78AC">
+            <wp:extent cx="5943600" cy="4454525"/>
+            <wp:effectExtent l="0" t="0" r="0" b="3175"/>
+            <wp:docPr id="17" name="Picture 17"/>
+            <wp:cNvGraphicFramePr>
+              <a:graphicFrameLocks xmlns:a="http://schemas.openxmlformats.org/drawingml/2006/main" noChangeAspect="1"/>
+            </wp:cNvGraphicFramePr>
+            <a:graphic xmlns:a="http://schemas.openxmlformats.org/drawingml/2006/main">
+              <a:graphicData uri="http://schemas.openxmlformats.org/drawingml/2006/picture">
+                <pic:pic xmlns:pic="http://schemas.openxmlformats.org/drawingml/2006/picture">
+                  <pic:nvPicPr>
+                    <pic:cNvPr id="1" name=""/>
+                    <pic:cNvPicPr/>
+                  </pic:nvPicPr>
+                  <pic:blipFill>
+                    <a:blip r:embed="rId24"/>
+                    <a:stretch>
+                      <a:fillRect/>
+                    </a:stretch>
+                  </pic:blipFill>
+                  <pic:spPr>
+                    <a:xfrm>
+                      <a:off x="0" y="0"/>
+                      <a:ext cx="5943600" cy="4454525"/>
+                    </a:xfrm>
+                    <a:prstGeom prst="rect">
+                      <a:avLst/>
+                    </a:prstGeom>
+                  </pic:spPr>
+                </pic:pic>
+              </a:graphicData>
+            </a:graphic>
+          </wp:inline>
+        </w:drawing>
+      </w:r>
+    </w:p>
+    <w:p>
+      <w:pPr>
+        <w:spacing w:before="0" w:after="120" w:line="276" w:lineRule="auto"/>
+        <w:jc w:val="center"/>
+        <w:rPr>
+          <w:sz w:val="16"/>
+          <w:szCs w:val="16"/>
+        </w:rPr>
+      </w:pPr>
+      <w:r>
+        <w:rPr>
+          <w:sz w:val="16"/>
+          <w:szCs w:val="16"/>
+        </w:rPr>
+        <w:t>Hình 2.5.2 – Hiển thị giá bán theo BR-03 (có/không salePrice)</w:t>
       </w:r>
     </w:p>
     <w:p>
@@ -4902,7 +5445,6 @@
           <w:i/>
           <w:sz w:val="22"/>
         </w:rPr>
-        <w:lastRenderedPageBreak/>
         <w:t>[Chèn ảnh: đoạn code axiosClient.js / Network tab]</w:t>
       </w:r>
     </w:p>
@@ -4993,6 +5535,7 @@
         <w:rPr>
           <w:sz w:val="24"/>
         </w:rPr>
+        <w:lastRenderedPageBreak/>
         <w:t>authApi lấy user theo email/password; AuthContext lưu user + fake token (localStorage); LoginPage validate form; phân role admin/customer.</w:t>
       </w:r>
     </w:p>
@@ -5429,7 +5972,6 @@
         <w:rPr>
           <w:sz w:val="24"/>
         </w:rPr>
-        <w:lastRenderedPageBreak/>
         <w:t>Commit: feat(ui): add toast context with auto hide; feat(ui): add reusable confirm modal.</w:t>
       </w:r>
     </w:p>
@@ -5528,6 +6070,7 @@
           <w:i/>
           <w:sz w:val="22"/>
         </w:rPr>
+        <w:lastRenderedPageBreak/>
         <w:t>[Chèn ảnh: Navbar + lưới laptop + bộ lọc (desktop &amp; mobile 375px)]</w:t>
       </w:r>
     </w:p>
@@ -5959,7 +6502,6 @@
           <w:i/>
           <w:sz w:val="22"/>
         </w:rPr>
-        <w:lastRenderedPageBreak/>
         <w:t>[Chèn ảnh: thêm giỏ / cập nhật / xoá]</w:t>
       </w:r>
     </w:p>
@@ -6044,6 +6586,7 @@
         <w:rPr>
           <w:sz w:val="24"/>
         </w:rPr>
+        <w:lastRenderedPageBreak/>
         <w:t>Checkout tạo order thật; khách xem/huỷ đơn; admin cập nhật trạng thái đơn.</w:t>
       </w:r>
     </w:p>
@@ -6569,7 +7112,6 @@
         <w:rPr>
           <w:sz w:val="24"/>
         </w:rPr>
-        <w:lastRenderedPageBreak/>
         <w:t>Đăng nhập admin / customer; phân quyền đúng</w:t>
       </w:r>
     </w:p>
@@ -6665,6 +7207,7 @@
           <w:i/>
           <w:sz w:val="22"/>
         </w:rPr>
+        <w:lastRenderedPageBreak/>
         <w:t>[Chèn ảnh: vài bước test UI + link video]</w:t>
       </w:r>
     </w:p>
@@ -6908,13 +7451,12 @@
           <w:b/>
           <w:sz w:val="24"/>
         </w:rPr>
-        <w:lastRenderedPageBreak/>
         <w:t>— Hết báo cáo —</w:t>
       </w:r>
     </w:p>
     <w:sectPr>
-      <w:headerReference w:type="default" r:id="rId15"/>
-      <w:footerReference w:type="default" r:id="rId16"/>
+      <w:headerReference w:type="default" r:id="rId25"/>
+      <w:footerReference w:type="default" r:id="rId26"/>
       <w:pgSz w:w="12240" w:h="15840"/>
       <w:pgMar w:top="1440" w:right="1440" w:bottom="1440" w:left="1440" w:header="720" w:footer="720" w:gutter="0"/>
       <w:cols w:space="720"/>

</xml_diff>